<commit_message>
docs(CNJ): migração Azure DevOps → GitLab + evidências e correções
- Plataforma/terminologia: Azure DevOps → GitLab; Pull Request → Merge Request
- Evidências GitLab alinhadas ao conteúdo real: branches, MR !12/!13 (DoD/aprovação),
  tags v2.0.0/v2.0.1/v2.0.2, pipeline #236, estrutura do repo (estrutura_cnj, .gitlab-ci.yml)
- Removidos prints do Azure (devops_cnj_*); estrutura_cnj substitui estrutura_WorkerAndamentos
- Planilha GEST: plataforma corrigida e ref de evidência EV-* → REL-VV-AASPCNJ01-001
- Headers: placeholder "Versão Data" preenchido (INDICE 1.5; CAP 1.1 + prefixo); docs alterados em v1.1
- Registros mantidos .docx-only (remoção das fontes .md)

Co-Authored-By: Claude Opus 4.8 <noreply@anthropic.com>
</commit_message>
<xml_diff>
--- a/mps-nivel-c/oficial/04_registros/AASP_CNJ/CAP-AASPCNJ01-001_Registro-de-Capacitacao-da-Equipe.docx
+++ b/mps-nivel-c/oficial/04_registros/AASP_CNJ/CAP-AASPCNJ01-001_Registro-de-Capacitacao-da-Equipe.docx
@@ -34,7 +34,7 @@
           <w:color w:val="555555"/>
           <w:sz w:val="20"/>
         </w:rPr>
-        <w:t>Revisão   ·   Versão Data   ·   11/06/2026   ·   Timeware Brasil</w:t>
+        <w:t>CAP-AASPCNJ01-001   ·   Versão 1.1   ·   17/06/2026   ·   Timeware Brasil</w:t>
       </w:r>
     </w:p>
     <w:p>
@@ -216,17 +216,8 @@
             </w:tcMar>
           </w:tcPr>
           <w:p>
-            <w:pPr>
-              <w:spacing w:before="40" w:after="40"/>
-            </w:pPr>
             <w:r>
-              <w:rPr>
-                <w:rFonts w:ascii="Calibri" w:hAnsi="Calibri"/>
-                <w:b w:val="0"/>
-                <w:i w:val="0"/>
-                <w:sz w:val="20"/>
-              </w:rPr>
-              <w:t>1.0</w:t>
+              <w:t>1.1</w:t>
             </w:r>
           </w:p>
         </w:tc>
@@ -272,17 +263,8 @@
             </w:tcMar>
           </w:tcPr>
           <w:p>
-            <w:pPr>
-              <w:spacing w:before="40" w:after="40"/>
-            </w:pPr>
             <w:r>
-              <w:rPr>
-                <w:rFonts w:ascii="Calibri" w:hAnsi="Calibri"/>
-                <w:b w:val="0"/>
-                <w:i w:val="0"/>
-                <w:sz w:val="20"/>
-              </w:rPr>
-              <w:t>11/06/2026</w:t>
+              <w:t>17/06/2026</w:t>
             </w:r>
           </w:p>
         </w:tc>
@@ -1287,7 +1269,7 @@
                 <w:i w:val="0"/>
                 <w:sz w:val="20"/>
               </w:rPr>
-              <w:t>Revisão nas integrações de branches no Azure DevOps, garantindo ciência das mudanças por todo o time (ver REV-AASPCNJ01-001)</w:t>
+              <w:t>Revisão nas integrações de branches no GitLab, garantindo ciência das mudanças por todo o time (ver REV-AASPCNJ01-001)</w:t>
             </w:r>
           </w:p>
         </w:tc>
@@ -1399,7 +1381,7 @@
                 <w:i w:val="0"/>
                 <w:sz w:val="20"/>
               </w:rPr>
-              <w:t>Coleções Postman da API CNJ e registros de banco disponibilizados no Azure DevOps</w:t>
+              <w:t>Coleções Postman da API CNJ e registros de banco disponibilizados no GitLab</w:t>
             </w:r>
           </w:p>
         </w:tc>
@@ -1489,7 +1471,7 @@
           <w:i w:val="0"/>
           <w:sz w:val="22"/>
         </w:rPr>
-        <w:t>A equipe já atuava com as tecnologias core (.NET, Azure DevOps, RabbitMQ, Elasticsearch), dispensando treinamento formal específico. As ações de preparo focaram no contexto da nova arquitetura de captura (DataJud/CNJ e fallback). O Plano de Capacitação Organizacional aplicável está registrado em PLA-CAP-001.</w:t>
+        <w:t>A equipe já atuava com as tecnologias core (.NET, GitLab, RabbitMQ, Elasticsearch), dispensando treinamento formal específico. As ações de preparo focaram no contexto da nova arquitetura de captura (DataJud/CNJ e fallback). O Plano de Capacitação Organizacional aplicável está registrado em PLA-CAP-001.</w:t>
       </w:r>
     </w:p>
     <w:p>
@@ -1566,16 +1548,7 @@
             <w:shd w:val="clear" w:color="auto" w:fill="D6E4F0"/>
           </w:tcPr>
           <w:p>
-            <w:pPr>
-              <w:spacing w:before="40" w:after="40"/>
-            </w:pPr>
             <w:r>
-              <w:rPr>
-                <w:rFonts w:ascii="Calibri" w:hAnsi="Calibri"/>
-                <w:b/>
-                <w:i w:val="0"/>
-                <w:sz w:val="20"/>
-              </w:rPr>
               <w:t>Data</w:t>
             </w:r>
           </w:p>
@@ -1735,6 +1708,48 @@
                 <w:sz w:val="20"/>
               </w:rPr>
               <w:t>Registro de capacitação da equipe consolidado a partir do Registro de Projeto AASP_CNJ v1.0 (08/06/2026).</w:t>
+            </w:r>
+          </w:p>
+        </w:tc>
+      </w:tr>
+      <w:tr>
+        <w:tc>
+          <w:tcPr>
+            <w:tcW w:type="dxa" w:w="2225"/>
+          </w:tcPr>
+          <w:p>
+            <w:r>
+              <w:t>1.1</w:t>
+            </w:r>
+          </w:p>
+        </w:tc>
+        <w:tc>
+          <w:tcPr>
+            <w:tcW w:type="dxa" w:w="2225"/>
+          </w:tcPr>
+          <w:p>
+            <w:r>
+              <w:t>17/06/2026</w:t>
+            </w:r>
+          </w:p>
+        </w:tc>
+        <w:tc>
+          <w:tcPr>
+            <w:tcW w:type="dxa" w:w="2225"/>
+          </w:tcPr>
+          <w:p>
+            <w:r>
+              <w:t>Time de Melhoria Contínua</w:t>
+            </w:r>
+          </w:p>
+        </w:tc>
+        <w:tc>
+          <w:tcPr>
+            <w:tcW w:type="dxa" w:w="2225"/>
+          </w:tcPr>
+          <w:p>
+            <w:r>
+              <w:t>Plataforma de versionamento corrigida (Azure DevOps → GitLab).</w:t>
             </w:r>
           </w:p>
         </w:tc>

</xml_diff>